<commit_message>
Cambio en el er
agregue la nueva imagen de la actulizacion del ER
</commit_message>
<xml_diff>
--- a/Documetacion/Sistema de Información para la Optimización de Reservas y Gestión de Ventas Online del Hotel El Campín (1).docx
+++ b/Documetacion/Sistema de Información para la Optimización de Reservas y Gestión de Ventas Online del Hotel El Campín (1).docx
@@ -1,6 +1,6 @@
 
 <file path=word/document.xml><?xml version="1.0" encoding="utf-8"?>
-<w:document xmlns:wpc="http://schemas.microsoft.com/office/word/2010/wordprocessingCanvas" xmlns:cx="http://schemas.microsoft.com/office/drawing/2014/chartex" xmlns:cx1="http://schemas.microsoft.com/office/drawing/2015/9/8/chartex" xmlns:cx2="http://schemas.microsoft.com/office/drawing/2015/10/21/chartex" xmlns:cx3="http://schemas.microsoft.com/office/drawing/2016/5/9/chartex" xmlns:cx4="http://schemas.microsoft.com/office/drawing/2016/5/10/chartex" xmlns:cx5="http://schemas.microsoft.com/office/drawing/2016/5/11/chartex" xmlns:cx6="http://schemas.microsoft.com/office/drawing/2016/5/12/chartex" xmlns:cx7="http://schemas.microsoft.com/office/drawing/2016/5/13/chartex" xmlns:cx8="http://schemas.microsoft.com/office/drawing/2016/5/14/chartex" xmlns:mc="http://schemas.openxmlformats.org/markup-compatibility/2006" xmlns:aink="http://schemas.microsoft.com/office/drawing/2016/ink" xmlns:am3d="http://schemas.microsoft.com/office/drawing/2017/model3d" xmlns:o="urn:schemas-microsoft-com:office:office" xmlns:oel="http://schemas.microsoft.com/office/2019/extlst" xmlns:r="http://schemas.openxmlformats.org/officeDocument/2006/relationships" xmlns:m="http://schemas.openxmlformats.org/officeDocument/2006/math" xmlns:v="urn:schemas-microsoft-com:vml" xmlns:wp14="http://schemas.microsoft.com/office/word/2010/wordprocessingDrawing" xmlns:wp="http://schemas.openxmlformats.org/drawingml/2006/wordprocessingDrawing" xmlns:w10="urn:schemas-microsoft-com:office:word" xmlns:w="http://schemas.openxmlformats.org/wordprocessingml/2006/main" xmlns:w14="http://schemas.microsoft.com/office/word/2010/wordml" xmlns:w15="http://schemas.microsoft.com/office/word/2012/wordml" xmlns:w16cex="http://schemas.microsoft.com/office/word/2018/wordml/cex" xmlns:w16cid="http://schemas.microsoft.com/office/word/2016/wordml/cid" xmlns:w16="http://schemas.microsoft.com/office/word/2018/wordml" xmlns:w16du="http://schemas.microsoft.com/office/word/2023/wordml/word16du" xmlns:w16sdtdh="http://schemas.microsoft.com/office/word/2020/wordml/sdtdatahash" xmlns:w16sdtfl="http://schemas.microsoft.com/office/word/2024/wordml/sdtformatlock" xmlns:w16se="http://schemas.microsoft.com/office/word/2015/wordml/symex" xmlns:wpg="http://schemas.microsoft.com/office/word/2010/wordprocessingGroup" xmlns:wpi="http://schemas.microsoft.com/office/word/2010/wordprocessingInk" xmlns:wne="http://schemas.microsoft.com/office/word/2006/wordml" xmlns:wps="http://schemas.microsoft.com/office/word/2010/wordprocessingShape" mc:Ignorable="w14 w15 w16se w16cid w16 w16cex w16sdtdh w16sdtfl w16du wp14">
+<w:document xmlns:wpc="http://schemas.microsoft.com/office/word/2010/wordprocessingCanvas" xmlns:cx="http://schemas.microsoft.com/office/drawing/2014/chartex" xmlns:cx1="http://schemas.microsoft.com/office/drawing/2015/9/8/chartex" xmlns:cx2="http://schemas.microsoft.com/office/drawing/2015/10/21/chartex" xmlns:cx3="http://schemas.microsoft.com/office/drawing/2016/5/9/chartex" xmlns:cx4="http://schemas.microsoft.com/office/drawing/2016/5/10/chartex" xmlns:cx5="http://schemas.microsoft.com/office/drawing/2016/5/11/chartex" xmlns:cx6="http://schemas.microsoft.com/office/drawing/2016/5/12/chartex" xmlns:cx7="http://schemas.microsoft.com/office/drawing/2016/5/13/chartex" xmlns:cx8="http://schemas.microsoft.com/office/drawing/2016/5/14/chartex" xmlns:mc="http://schemas.openxmlformats.org/markup-compatibility/2006" xmlns:aink="http://schemas.microsoft.com/office/drawing/2016/ink" xmlns:am3d="http://schemas.microsoft.com/office/drawing/2017/model3d" xmlns:o="urn:schemas-microsoft-com:office:office" xmlns:r="http://schemas.openxmlformats.org/officeDocument/2006/relationships" xmlns:m="http://schemas.openxmlformats.org/officeDocument/2006/math" xmlns:v="urn:schemas-microsoft-com:vml" xmlns:wp14="http://schemas.microsoft.com/office/word/2010/wordprocessingDrawing" xmlns:wp="http://schemas.openxmlformats.org/drawingml/2006/wordprocessingDrawing" xmlns:w10="urn:schemas-microsoft-com:office:word" xmlns:w="http://schemas.openxmlformats.org/wordprocessingml/2006/main" xmlns:w14="http://schemas.microsoft.com/office/word/2010/wordml" xmlns:w15="http://schemas.microsoft.com/office/word/2012/wordml" xmlns:w16cid="http://schemas.microsoft.com/office/word/2016/wordml/cid" xmlns:w16se="http://schemas.microsoft.com/office/word/2015/wordml/symex" xmlns:wpg="http://schemas.microsoft.com/office/word/2010/wordprocessingGroup" xmlns:wpi="http://schemas.microsoft.com/office/word/2010/wordprocessingInk" xmlns:wne="http://schemas.microsoft.com/office/word/2006/wordml" xmlns:wps="http://schemas.microsoft.com/office/word/2010/wordprocessingShape" mc:Ignorable="w14 w15 w16se w16cid wp14">
   <w:body>
     <w:p>
       <w:pPr>
@@ -1937,7 +1937,23 @@
           <w:b w:val="0"/>
           <w:bCs w:val="0"/>
         </w:rPr>
-        <w:t>, por otro lado se hará uso de la observación participante.</w:t>
+        <w:t xml:space="preserve">, por otro </w:t>
+      </w:r>
+      <w:proofErr w:type="gramStart"/>
+      <w:r>
+        <w:rPr>
+          <w:b w:val="0"/>
+          <w:bCs w:val="0"/>
+        </w:rPr>
+        <w:t>lado</w:t>
+      </w:r>
+      <w:proofErr w:type="gramEnd"/>
+      <w:r>
+        <w:rPr>
+          <w:b w:val="0"/>
+          <w:bCs w:val="0"/>
+        </w:rPr>
+        <w:t xml:space="preserve"> se hará uso de la observación participante.</w:t>
       </w:r>
     </w:p>
     <w:p>
@@ -2112,6 +2128,9 @@
               <w:jc w:val="left"/>
             </w:pPr>
             <w:r>
+              <w:rPr>
+                <w:noProof/>
+              </w:rPr>
               <w:drawing>
                 <wp:anchor distT="0" distB="0" distL="114300" distR="114300" simplePos="0" relativeHeight="251659264" behindDoc="0" locked="0" layoutInCell="1" allowOverlap="1" wp14:anchorId="3CA33BDF" wp14:editId="37342172">
                   <wp:simplePos x="0" y="0"/>
@@ -2857,21 +2876,7 @@
                 <w:b w:val="0"/>
                 <w:bCs w:val="0"/>
               </w:rPr>
-              <w:t>El sistema debe cumplir con las regulaciones de protección de datos</w:t>
-            </w:r>
-            <w:r>
-              <w:rPr>
-                <w:b w:val="0"/>
-                <w:bCs w:val="0"/>
-              </w:rPr>
-              <w:t xml:space="preserve"> </w:t>
-            </w:r>
-            <w:r>
-              <w:rPr>
-                <w:b w:val="0"/>
-                <w:bCs w:val="0"/>
-              </w:rPr>
-              <w:t>personales.</w:t>
+              <w:t>El sistema debe cumplir con las regulaciones de protección de datos personales.</w:t>
             </w:r>
           </w:p>
           <w:p>
@@ -3208,6 +3213,9 @@
               <w:ind w:right="0"/>
             </w:pPr>
             <w:r>
+              <w:rPr>
+                <w:noProof/>
+              </w:rPr>
               <w:drawing>
                 <wp:anchor distT="0" distB="0" distL="0" distR="0" simplePos="0" relativeHeight="251660288" behindDoc="1" locked="0" layoutInCell="1" allowOverlap="1" wp14:anchorId="5D3CA1A4" wp14:editId="0A618EDE">
                   <wp:simplePos x="0" y="0"/>
@@ -3277,6 +3285,9 @@
               <w:jc w:val="left"/>
             </w:pPr>
             <w:r>
+              <w:rPr>
+                <w:noProof/>
+              </w:rPr>
               <mc:AlternateContent>
                 <mc:Choice Requires="wps">
                   <w:drawing>
@@ -3329,7 +3340,7 @@
                     </wp:anchor>
                   </w:drawing>
                 </mc:Choice>
-                <mc:Fallback>
+                <mc:Fallback xmlns:w16sdtfl="http://schemas.microsoft.com/office/word/2024/wordml/sdtformatlock" xmlns:w16sdtdh="http://schemas.microsoft.com/office/word/2020/wordml/sdtdatahash" xmlns:w16du="http://schemas.microsoft.com/office/word/2023/wordml/word16du" xmlns:w16="http://schemas.microsoft.com/office/word/2018/wordml" xmlns:w16cex="http://schemas.microsoft.com/office/word/2018/wordml/cex" xmlns:oel="http://schemas.microsoft.com/office/2019/extlst">
                   <w:pict>
                     <v:shapetype w14:anchorId="53B9BE66" id="_x0000_t32" coordsize="21600,21600" o:spt="32" o:oned="t" path="m,l21600,21600e" filled="f">
                       <v:path arrowok="t" fillok="f" o:connecttype="none"/>
@@ -3372,6 +3383,9 @@
               <w:ind w:right="0"/>
             </w:pPr>
             <w:r>
+              <w:rPr>
+                <w:noProof/>
+              </w:rPr>
               <w:drawing>
                 <wp:anchor distT="0" distB="0" distL="0" distR="0" simplePos="0" relativeHeight="251662336" behindDoc="1" locked="0" layoutInCell="1" allowOverlap="1" wp14:anchorId="2015319C" wp14:editId="26A2F9D6">
                   <wp:simplePos x="0" y="0"/>
@@ -3455,6 +3469,9 @@
               <w:ind w:right="0"/>
             </w:pPr>
             <w:r>
+              <w:rPr>
+                <w:noProof/>
+              </w:rPr>
               <w:drawing>
                 <wp:inline distT="0" distB="0" distL="0" distR="0" wp14:anchorId="38D92AC0" wp14:editId="04F7FA30">
                   <wp:extent cx="2057400" cy="114300"/>
@@ -3535,6 +3552,9 @@
               <w:jc w:val="left"/>
             </w:pPr>
             <w:r>
+              <w:rPr>
+                <w:noProof/>
+              </w:rPr>
               <w:drawing>
                 <wp:anchor distT="0" distB="0" distL="114300" distR="114300" simplePos="0" relativeHeight="251663360" behindDoc="0" locked="0" layoutInCell="1" allowOverlap="1" wp14:anchorId="681CEDBC" wp14:editId="544A37E5">
                   <wp:simplePos x="0" y="0"/>
@@ -3608,6 +3628,9 @@
               <w:spacing w:before="158" w:line="480" w:lineRule="auto"/>
             </w:pPr>
             <w:r>
+              <w:rPr>
+                <w:noProof/>
+              </w:rPr>
               <w:drawing>
                 <wp:inline distT="0" distB="0" distL="0" distR="0" wp14:anchorId="7E49DF56" wp14:editId="746EC6FB">
                   <wp:extent cx="1790700" cy="95250"/>
@@ -3692,6 +3715,9 @@
               <w:ind w:right="0"/>
             </w:pPr>
             <w:r>
+              <w:rPr>
+                <w:noProof/>
+              </w:rPr>
               <w:drawing>
                 <wp:anchor distT="0" distB="0" distL="114300" distR="114300" simplePos="0" relativeHeight="251665408" behindDoc="0" locked="0" layoutInCell="1" allowOverlap="1" wp14:anchorId="1829F5F1" wp14:editId="45BCD313">
                   <wp:simplePos x="0" y="0"/>
@@ -4175,7 +4201,14 @@
                 <w:sz w:val="24"/>
                 <w:szCs w:val="24"/>
               </w:rPr>
-              <w:t>1. Selección de fechas :</w:t>
+              <w:t xml:space="preserve">1. Selección de </w:t>
+            </w:r>
+            <w:r>
+              <w:rPr>
+                <w:sz w:val="24"/>
+                <w:szCs w:val="24"/>
+              </w:rPr>
+              <w:t>fechas:</w:t>
             </w:r>
           </w:p>
           <w:p>
@@ -5783,7 +5816,7 @@
                     </wp:anchor>
                   </w:drawing>
                 </mc:Choice>
-                <mc:Fallback>
+                <mc:Fallback xmlns:w16sdtfl="http://schemas.microsoft.com/office/word/2024/wordml/sdtformatlock" xmlns:w16sdtdh="http://schemas.microsoft.com/office/word/2020/wordml/sdtdatahash" xmlns:w16du="http://schemas.microsoft.com/office/word/2023/wordml/word16du" xmlns:w16="http://schemas.microsoft.com/office/word/2018/wordml" xmlns:w16cex="http://schemas.microsoft.com/office/word/2018/wordml/cex" xmlns:oel="http://schemas.microsoft.com/office/2019/extlst">
                   <w:pict>
                     <v:shape w14:anchorId="64AE6FF4" id="Conector recto de flecha 19" o:spid="_x0000_s1026" type="#_x0000_t32" style="position:absolute;margin-left:2pt;margin-top:60.9pt;width:0;height:3pt;z-index:251668480;visibility:visible;mso-wrap-style:square;mso-width-percent:0;mso-height-percent:0;mso-wrap-distance-left:9pt;mso-wrap-distance-top:0;mso-wrap-distance-right:9pt;mso-wrap-distance-bottom:0;mso-position-horizontal:absolute;mso-position-horizontal-relative:text;mso-position-vertical:absolute;mso-position-vertical-relative:text;mso-width-percent:0;mso-height-percent:0;mso-width-relative:page;mso-height-relative:page" o:gfxdata="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" strokecolor="black [3200]" strokeweight="3pt">
                       <v:stroke startarrowwidth="narrow" startarrowlength="short" endarrowwidth="narrow" endarrowlength="short"/>
@@ -5964,7 +5997,7 @@
                     </wp:anchor>
                   </w:drawing>
                 </mc:Choice>
-                <mc:Fallback>
+                <mc:Fallback xmlns:w16sdtfl="http://schemas.microsoft.com/office/word/2024/wordml/sdtformatlock" xmlns:w16sdtdh="http://schemas.microsoft.com/office/word/2020/wordml/sdtdatahash" xmlns:w16du="http://schemas.microsoft.com/office/word/2023/wordml/word16du" xmlns:w16="http://schemas.microsoft.com/office/word/2018/wordml" xmlns:w16cex="http://schemas.microsoft.com/office/word/2018/wordml/cex" xmlns:oel="http://schemas.microsoft.com/office/2019/extlst">
                   <w:pict>
                     <v:shape w14:anchorId="4479D6BF" id="Conector recto de flecha 17" o:spid="_x0000_s1026" type="#_x0000_t32" style="position:absolute;margin-left:9pt;margin-top:63.9pt;width:0;height:3pt;z-index:251670528;visibility:visible;mso-wrap-style:square;mso-width-percent:0;mso-height-percent:0;mso-wrap-distance-left:9pt;mso-wrap-distance-top:0;mso-wrap-distance-right:9pt;mso-wrap-distance-bottom:0;mso-position-horizontal:absolute;mso-position-horizontal-relative:text;mso-position-vertical:absolute;mso-position-vertical-relative:text;mso-width-percent:0;mso-height-percent:0;mso-width-relative:page;mso-height-relative:page" o:gfxdata="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" strokecolor="black [3200]" strokeweight="3pt">
                       <v:stroke startarrowwidth="narrow" startarrowlength="short" endarrowwidth="narrow" endarrowlength="short"/>
@@ -6223,7 +6256,7 @@
                     </wp:anchor>
                   </w:drawing>
                 </mc:Choice>
-                <mc:Fallback>
+                <mc:Fallback xmlns:w16sdtfl="http://schemas.microsoft.com/office/word/2024/wordml/sdtformatlock" xmlns:w16sdtdh="http://schemas.microsoft.com/office/word/2020/wordml/sdtdatahash" xmlns:w16du="http://schemas.microsoft.com/office/word/2023/wordml/word16du" xmlns:w16="http://schemas.microsoft.com/office/word/2018/wordml" xmlns:w16cex="http://schemas.microsoft.com/office/word/2018/wordml/cex" xmlns:oel="http://schemas.microsoft.com/office/2019/extlst">
                   <w:pict>
                     <v:shape w14:anchorId="2CE62B53" id="Conector recto de flecha 15" o:spid="_x0000_s1026" type="#_x0000_t32" style="position:absolute;margin-left:-6pt;margin-top:22pt;width:.75pt;height:3pt;rotation:180;flip:x;z-index:251671552;visibility:visible;mso-wrap-style:square;mso-width-percent:0;mso-height-percent:0;mso-wrap-distance-left:9pt;mso-wrap-distance-top:0;mso-wrap-distance-right:9pt;mso-wrap-distance-bottom:0;mso-position-horizontal:absolute;mso-position-horizontal-relative:text;mso-position-vertical:absolute;mso-position-vertical-relative:text;mso-width-percent:0;mso-height-percent:0;mso-width-relative:page;mso-height-relative:page" o:gfxdata="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" strokecolor="black [3200]" strokeweight="3pt">
                       <v:stroke startarrowwidth="narrow" startarrowlength="short" endarrowwidth="narrow" endarrowlength="short"/>
@@ -6310,6 +6343,9 @@
               <w:jc w:val="left"/>
             </w:pPr>
             <w:r>
+              <w:rPr>
+                <w:noProof/>
+              </w:rPr>
               <w:drawing>
                 <wp:anchor distT="0" distB="0" distL="114300" distR="114300" simplePos="0" relativeHeight="251673600" behindDoc="0" locked="0" layoutInCell="1" allowOverlap="1" wp14:anchorId="7C5AEE17" wp14:editId="66A78E90">
                   <wp:simplePos x="0" y="0"/>
@@ -8154,6 +8190,7 @@
               <w:rPr>
                 <w:b w:val="0"/>
                 <w:bCs w:val="0"/>
+                <w:noProof/>
               </w:rPr>
               <w:drawing>
                 <wp:anchor distT="0" distB="0" distL="0" distR="0" simplePos="0" relativeHeight="251674624" behindDoc="1" locked="0" layoutInCell="1" allowOverlap="1" wp14:anchorId="476CDE4B" wp14:editId="0348019A">
@@ -8257,6 +8294,9 @@
               <w:ind w:right="0"/>
             </w:pPr>
             <w:r>
+              <w:rPr>
+                <w:noProof/>
+              </w:rPr>
               <mc:AlternateContent>
                 <mc:Choice Requires="wps">
                   <w:drawing>
@@ -8309,7 +8349,7 @@
                     </wp:anchor>
                   </w:drawing>
                 </mc:Choice>
-                <mc:Fallback>
+                <mc:Fallback xmlns:w16sdtfl="http://schemas.microsoft.com/office/word/2024/wordml/sdtformatlock" xmlns:w16sdtdh="http://schemas.microsoft.com/office/word/2020/wordml/sdtdatahash" xmlns:w16du="http://schemas.microsoft.com/office/word/2023/wordml/word16du" xmlns:w16="http://schemas.microsoft.com/office/word/2018/wordml" xmlns:w16cex="http://schemas.microsoft.com/office/word/2018/wordml/cex" xmlns:oel="http://schemas.microsoft.com/office/2019/extlst">
                   <w:pict>
                     <v:shape w14:anchorId="7B78530D" id="Conector recto de flecha 33" o:spid="_x0000_s1026" type="#_x0000_t32" style="position:absolute;margin-left:2pt;margin-top:60.9pt;width:0;height:3pt;z-index:251676672;visibility:visible;mso-wrap-style:square;mso-width-percent:0;mso-height-percent:0;mso-wrap-distance-left:9pt;mso-wrap-distance-top:0;mso-wrap-distance-right:9pt;mso-wrap-distance-bottom:0;mso-position-horizontal:absolute;mso-position-horizontal-relative:text;mso-position-vertical:absolute;mso-position-vertical-relative:text;mso-width-percent:0;mso-height-percent:0;mso-width-relative:page;mso-height-relative:page" o:gfxdata="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" strokecolor="black [3200]" strokeweight="3pt">
                       <v:stroke startarrowwidth="narrow" startarrowlength="short" endarrowwidth="narrow" endarrowlength="short"/>
@@ -8319,6 +8359,9 @@
               </mc:AlternateContent>
             </w:r>
             <w:r>
+              <w:rPr>
+                <w:noProof/>
+              </w:rPr>
               <w:drawing>
                 <wp:anchor distT="0" distB="0" distL="114300" distR="114300" simplePos="0" relativeHeight="251675648" behindDoc="0" locked="0" layoutInCell="1" allowOverlap="1" wp14:anchorId="1C10CCE0" wp14:editId="756B577C">
                   <wp:simplePos x="0" y="0"/>
@@ -8416,6 +8459,9 @@
               <w:jc w:val="left"/>
             </w:pPr>
             <w:r>
+              <w:rPr>
+                <w:noProof/>
+              </w:rPr>
               <mc:AlternateContent>
                 <mc:Choice Requires="wps">
                   <w:drawing>
@@ -8468,7 +8514,7 @@
                     </wp:anchor>
                   </w:drawing>
                 </mc:Choice>
-                <mc:Fallback>
+                <mc:Fallback xmlns:w16sdtfl="http://schemas.microsoft.com/office/word/2024/wordml/sdtformatlock" xmlns:w16sdtdh="http://schemas.microsoft.com/office/word/2020/wordml/sdtdatahash" xmlns:w16du="http://schemas.microsoft.com/office/word/2023/wordml/word16du" xmlns:w16="http://schemas.microsoft.com/office/word/2018/wordml" xmlns:w16cex="http://schemas.microsoft.com/office/word/2018/wordml/cex" xmlns:oel="http://schemas.microsoft.com/office/2019/extlst">
                   <w:pict>
                     <v:shape w14:anchorId="0A80349A" id="Conector recto de flecha 31" o:spid="_x0000_s1026" type="#_x0000_t32" style="position:absolute;margin-left:9pt;margin-top:63.9pt;width:0;height:3pt;z-index:251678720;visibility:visible;mso-wrap-style:square;mso-width-percent:0;mso-height-percent:0;mso-wrap-distance-left:9pt;mso-wrap-distance-top:0;mso-wrap-distance-right:9pt;mso-wrap-distance-bottom:0;mso-position-horizontal:absolute;mso-position-horizontal-relative:text;mso-position-vertical:absolute;mso-position-vertical-relative:text;mso-width-percent:0;mso-height-percent:0;mso-width-relative:page;mso-height-relative:page" o:gfxdata="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" strokecolor="black [3200]" strokeweight="3pt">
                       <v:stroke startarrowwidth="narrow" startarrowlength="short" endarrowwidth="narrow" endarrowlength="short"/>
@@ -8478,6 +8524,9 @@
               </mc:AlternateContent>
             </w:r>
             <w:r>
+              <w:rPr>
+                <w:noProof/>
+              </w:rPr>
               <w:drawing>
                 <wp:anchor distT="0" distB="0" distL="0" distR="0" simplePos="0" relativeHeight="251677696" behindDoc="1" locked="0" layoutInCell="1" allowOverlap="1" wp14:anchorId="7DB5134B" wp14:editId="4BAB1E55">
                   <wp:simplePos x="0" y="0"/>
@@ -8584,6 +8633,9 @@
               <w:jc w:val="left"/>
             </w:pPr>
             <w:r>
+              <w:rPr>
+                <w:noProof/>
+              </w:rPr>
               <mc:AlternateContent>
                 <mc:Choice Requires="wps">
                   <w:drawing>
@@ -8636,7 +8688,7 @@
                     </wp:anchor>
                   </w:drawing>
                 </mc:Choice>
-                <mc:Fallback>
+                <mc:Fallback xmlns:w16sdtfl="http://schemas.microsoft.com/office/word/2024/wordml/sdtformatlock" xmlns:w16sdtdh="http://schemas.microsoft.com/office/word/2020/wordml/sdtdatahash" xmlns:w16du="http://schemas.microsoft.com/office/word/2023/wordml/word16du" xmlns:w16="http://schemas.microsoft.com/office/word/2018/wordml" xmlns:w16cex="http://schemas.microsoft.com/office/word/2018/wordml/cex" xmlns:oel="http://schemas.microsoft.com/office/2019/extlst">
                   <w:pict>
                     <v:shape w14:anchorId="4AC48B4F" id="Conector recto de flecha 29" o:spid="_x0000_s1026" type="#_x0000_t32" style="position:absolute;margin-left:-6pt;margin-top:22pt;width:.75pt;height:3pt;rotation:180;flip:x;z-index:251679744;visibility:visible;mso-wrap-style:square;mso-width-percent:0;mso-height-percent:0;mso-wrap-distance-left:9pt;mso-wrap-distance-top:0;mso-wrap-distance-right:9pt;mso-wrap-distance-bottom:0;mso-position-horizontal:absolute;mso-position-horizontal-relative:text;mso-position-vertical:absolute;mso-position-vertical-relative:text;mso-width-percent:0;mso-height-percent:0;mso-width-relative:page;mso-height-relative:page" o:gfxdata="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" strokecolor="black [3200]" strokeweight="3pt">
                       <v:stroke startarrowwidth="narrow" startarrowlength="short" endarrowwidth="narrow" endarrowlength="short"/>
@@ -8715,6 +8767,9 @@
               <w:jc w:val="left"/>
             </w:pPr>
             <w:r>
+              <w:rPr>
+                <w:noProof/>
+              </w:rPr>
               <w:drawing>
                 <wp:anchor distT="0" distB="0" distL="114300" distR="114300" simplePos="0" relativeHeight="251681792" behindDoc="0" locked="0" layoutInCell="1" allowOverlap="1" wp14:anchorId="5CDEE211" wp14:editId="2A88033F">
                   <wp:simplePos x="0" y="0"/>
@@ -9800,6 +9855,9 @@
               <w:jc w:val="left"/>
             </w:pPr>
             <w:r>
+              <w:rPr>
+                <w:noProof/>
+              </w:rPr>
               <mc:AlternateContent>
                 <mc:Choice Requires="wps">
                   <w:drawing>
@@ -9852,7 +9910,7 @@
                     </wp:anchor>
                   </w:drawing>
                 </mc:Choice>
-                <mc:Fallback>
+                <mc:Fallback xmlns:w16sdtfl="http://schemas.microsoft.com/office/word/2024/wordml/sdtformatlock" xmlns:w16sdtdh="http://schemas.microsoft.com/office/word/2020/wordml/sdtdatahash" xmlns:w16du="http://schemas.microsoft.com/office/word/2023/wordml/word16du" xmlns:w16="http://schemas.microsoft.com/office/word/2018/wordml" xmlns:w16cex="http://schemas.microsoft.com/office/word/2018/wordml/cex" xmlns:oel="http://schemas.microsoft.com/office/2019/extlst">
                   <w:pict>
                     <v:shape w14:anchorId="0E8E3332" id="Conector recto de flecha 48" o:spid="_x0000_s1026" type="#_x0000_t32" style="position:absolute;margin-left:-4pt;margin-top:56.9pt;width:0;height:3pt;z-index:251683840;visibility:visible;mso-wrap-style:square;mso-width-percent:0;mso-height-percent:0;mso-wrap-distance-left:9pt;mso-wrap-distance-top:0;mso-wrap-distance-right:9pt;mso-wrap-distance-bottom:0;mso-position-horizontal:absolute;mso-position-horizontal-relative:text;mso-position-vertical:absolute;mso-position-vertical-relative:text;mso-width-percent:0;mso-height-percent:0;mso-width-relative:page;mso-height-relative:page" o:gfxdata="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" strokecolor="black [3200]" strokeweight="3pt">
                       <v:stroke startarrowwidth="narrow" startarrowlength="short" endarrowwidth="narrow" endarrowlength="short"/>
@@ -9862,6 +9920,9 @@
               </mc:AlternateContent>
             </w:r>
             <w:r>
+              <w:rPr>
+                <w:noProof/>
+              </w:rPr>
               <w:drawing>
                 <wp:anchor distT="0" distB="0" distL="114300" distR="114300" simplePos="0" relativeHeight="251682816" behindDoc="0" locked="0" layoutInCell="1" allowOverlap="1" wp14:anchorId="51016FD6" wp14:editId="0431E032">
                   <wp:simplePos x="0" y="0"/>
@@ -9960,6 +10021,9 @@
               <w:jc w:val="left"/>
             </w:pPr>
             <w:r>
+              <w:rPr>
+                <w:noProof/>
+              </w:rPr>
               <w:drawing>
                 <wp:anchor distT="0" distB="0" distL="114300" distR="114300" simplePos="0" relativeHeight="251684864" behindDoc="0" locked="0" layoutInCell="1" allowOverlap="1" wp14:anchorId="3F2C4B05" wp14:editId="3188D68F">
                   <wp:simplePos x="0" y="0"/>
@@ -10036,6 +10100,9 @@
               <w:ind w:right="0"/>
             </w:pPr>
             <w:r>
+              <w:rPr>
+                <w:noProof/>
+              </w:rPr>
               <w:drawing>
                 <wp:inline distT="0" distB="0" distL="0" distR="0" wp14:anchorId="5739DE2B" wp14:editId="3BE1C290">
                   <wp:extent cx="2057400" cy="114300"/>
@@ -10118,6 +10185,9 @@
               <w:jc w:val="left"/>
             </w:pPr>
             <w:r>
+              <w:rPr>
+                <w:noProof/>
+              </w:rPr>
               <mc:AlternateContent>
                 <mc:Choice Requires="wps">
                   <w:drawing>
@@ -10170,7 +10240,7 @@
                     </wp:anchor>
                   </w:drawing>
                 </mc:Choice>
-                <mc:Fallback>
+                <mc:Fallback xmlns:w16sdtfl="http://schemas.microsoft.com/office/word/2024/wordml/sdtformatlock" xmlns:w16sdtdh="http://schemas.microsoft.com/office/word/2020/wordml/sdtdatahash" xmlns:w16du="http://schemas.microsoft.com/office/word/2023/wordml/word16du" xmlns:w16="http://schemas.microsoft.com/office/word/2018/wordml" xmlns:w16cex="http://schemas.microsoft.com/office/word/2018/wordml/cex" xmlns:oel="http://schemas.microsoft.com/office/2019/extlst">
                   <w:pict>
                     <v:shape w14:anchorId="79A9F366" id="Conector recto de flecha 45" o:spid="_x0000_s1026" type="#_x0000_t32" style="position:absolute;margin-left:8pt;margin-top:80.65pt;width:119.75pt;height:9.5pt;rotation:180;flip:x;z-index:251686912;visibility:visible;mso-wrap-style:square;mso-width-percent:0;mso-height-percent:0;mso-wrap-distance-left:9pt;mso-wrap-distance-top:0;mso-wrap-distance-right:9pt;mso-wrap-distance-bottom:0;mso-position-horizontal:absolute;mso-position-horizontal-relative:text;mso-position-vertical:absolute;mso-position-vertical-relative:text;mso-width-percent:0;mso-height-percent:0;mso-width-relative:page;mso-height-relative:page" o:gfxdata="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" strokecolor="black [3200]" strokeweight="2pt">
                       <v:stroke startarrowwidth="narrow" startarrowlength="short" endarrowwidth="narrow" endarrowlength="short"/>
@@ -10180,6 +10250,9 @@
               </mc:AlternateContent>
             </w:r>
             <w:r>
+              <w:rPr>
+                <w:noProof/>
+              </w:rPr>
               <w:drawing>
                 <wp:anchor distT="0" distB="0" distL="114300" distR="114300" simplePos="0" relativeHeight="251685888" behindDoc="0" locked="0" layoutInCell="1" allowOverlap="1" wp14:anchorId="35995AB7" wp14:editId="58CC74FE">
                   <wp:simplePos x="0" y="0"/>
@@ -10351,6 +10424,7 @@
             <w:r>
               <w:rPr>
                 <w:rFonts w:ascii="Times New Roman" w:hAnsi="Times New Roman" w:cs="Times New Roman"/>
+                <w:noProof/>
                 <w:sz w:val="24"/>
                 <w:szCs w:val="24"/>
                 <w:lang w:val="es-ES"/>
@@ -11473,6 +11547,7 @@
             <w:r>
               <w:rPr>
                 <w:rFonts w:ascii="Times New Roman" w:hAnsi="Times New Roman" w:cs="Times New Roman"/>
+                <w:noProof/>
                 <w:sz w:val="24"/>
                 <w:szCs w:val="24"/>
                 <w:lang w:val="es-ES"/>
@@ -11529,7 +11604,7 @@
                     </wp:anchor>
                   </w:drawing>
                 </mc:Choice>
-                <mc:Fallback>
+                <mc:Fallback xmlns:w16sdtfl="http://schemas.microsoft.com/office/word/2024/wordml/sdtformatlock" xmlns:w16sdtdh="http://schemas.microsoft.com/office/word/2020/wordml/sdtdatahash" xmlns:w16du="http://schemas.microsoft.com/office/word/2023/wordml/word16du" xmlns:w16="http://schemas.microsoft.com/office/word/2018/wordml" xmlns:w16cex="http://schemas.microsoft.com/office/word/2018/wordml/cex" xmlns:oel="http://schemas.microsoft.com/office/2019/extlst">
                   <w:pict>
                     <v:shape w14:anchorId="6ABE40F0" id="Conector recto de flecha 62" o:spid="_x0000_s1026" type="#_x0000_t32" style="position:absolute;margin-left:-4pt;margin-top:56.9pt;width:0;height:3pt;z-index:251691008;visibility:visible;mso-wrap-style:square;mso-width-percent:0;mso-height-percent:0;mso-wrap-distance-left:9pt;mso-wrap-distance-top:0;mso-wrap-distance-right:9pt;mso-wrap-distance-bottom:0;mso-position-horizontal:absolute;mso-position-horizontal-relative:text;mso-position-vertical:absolute;mso-position-vertical-relative:text;mso-width-percent:0;mso-height-percent:0;mso-width-relative:page;mso-height-relative:page" o:gfxdata="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" strokecolor="black [3200]" strokeweight="3pt">
                       <v:stroke startarrowwidth="narrow" startarrowlength="short" endarrowwidth="narrow" endarrowlength="short"/>
@@ -11541,6 +11616,7 @@
             <w:r>
               <w:rPr>
                 <w:rFonts w:ascii="Times New Roman" w:hAnsi="Times New Roman" w:cs="Times New Roman"/>
+                <w:noProof/>
                 <w:sz w:val="24"/>
                 <w:szCs w:val="24"/>
                 <w:lang w:val="es-ES"/>
@@ -11665,6 +11741,7 @@
             <w:r>
               <w:rPr>
                 <w:rFonts w:ascii="Times New Roman" w:hAnsi="Times New Roman" w:cs="Times New Roman"/>
+                <w:noProof/>
                 <w:sz w:val="24"/>
                 <w:szCs w:val="24"/>
                 <w:lang w:val="es-ES"/>
@@ -11757,6 +11834,7 @@
               <w:rPr>
                 <w:rFonts w:ascii="Times New Roman" w:hAnsi="Times New Roman" w:cs="Times New Roman"/>
                 <w:b/>
+                <w:noProof/>
                 <w:sz w:val="24"/>
                 <w:szCs w:val="24"/>
                 <w:lang w:val="es-ES"/>
@@ -11870,6 +11948,7 @@
             <w:r>
               <w:rPr>
                 <w:rFonts w:ascii="Times New Roman" w:hAnsi="Times New Roman" w:cs="Times New Roman"/>
+                <w:noProof/>
                 <w:sz w:val="24"/>
                 <w:szCs w:val="24"/>
                 <w:lang w:val="es-ES"/>
@@ -11960,6 +12039,7 @@
             <w:r>
               <w:rPr>
                 <w:rFonts w:ascii="Times New Roman" w:hAnsi="Times New Roman" w:cs="Times New Roman"/>
+                <w:noProof/>
                 <w:sz w:val="24"/>
                 <w:szCs w:val="24"/>
                 <w:lang w:val="es-ES"/>
@@ -12016,7 +12096,7 @@
                     </wp:anchor>
                   </w:drawing>
                 </mc:Choice>
-                <mc:Fallback>
+                <mc:Fallback xmlns:w16sdtfl="http://schemas.microsoft.com/office/word/2024/wordml/sdtformatlock" xmlns:w16sdtdh="http://schemas.microsoft.com/office/word/2020/wordml/sdtdatahash" xmlns:w16du="http://schemas.microsoft.com/office/word/2023/wordml/word16du" xmlns:w16="http://schemas.microsoft.com/office/word/2018/wordml" xmlns:w16cex="http://schemas.microsoft.com/office/word/2018/wordml/cex" xmlns:oel="http://schemas.microsoft.com/office/2019/extlst">
                   <w:pict>
                     <v:shape w14:anchorId="25484C63" id="Conector recto de flecha 59" o:spid="_x0000_s1026" type="#_x0000_t32" style="position:absolute;margin-left:8.1pt;margin-top:15.6pt;width:123pt;height:3.6pt;rotation:180;flip:x;z-index:251694080;visibility:visible;mso-wrap-style:square;mso-width-percent:0;mso-height-percent:0;mso-wrap-distance-left:9pt;mso-wrap-distance-top:0;mso-wrap-distance-right:9pt;mso-wrap-distance-bottom:0;mso-position-horizontal:absolute;mso-position-horizontal-relative:text;mso-position-vertical:absolute;mso-position-vertical-relative:text;mso-width-percent:0;mso-height-percent:0;mso-width-relative:page;mso-height-relative:page" o:gfxdata="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" strokecolor="black [3200]" strokeweight="2pt">
                       <v:stroke startarrowwidth="narrow" startarrowlength="short" endarrowwidth="narrow" endarrowlength="short"/>
@@ -12827,10 +12907,10 @@
           <w:lang w:val="es-ES"/>
         </w:rPr>
         <w:drawing>
-          <wp:inline distT="0" distB="0" distL="0" distR="0" wp14:anchorId="51250350" wp14:editId="4983F800">
-            <wp:extent cx="6070600" cy="4690745"/>
+          <wp:inline distT="0" distB="0" distL="0" distR="0" wp14:anchorId="02C1723A" wp14:editId="153AE4F7">
+            <wp:extent cx="5803900" cy="4191000"/>
             <wp:effectExtent l="0" t="0" r="6350" b="0"/>
-            <wp:docPr id="130896039" name="Imagen 69"/>
+            <wp:docPr id="2" name="Imagen 2"/>
             <wp:cNvGraphicFramePr>
               <a:graphicFrameLocks xmlns:a="http://schemas.openxmlformats.org/drawingml/2006/main" noChangeAspect="1"/>
             </wp:cNvGraphicFramePr>
@@ -12838,10 +12918,10 @@
               <a:graphicData uri="http://schemas.openxmlformats.org/drawingml/2006/picture">
                 <pic:pic xmlns:pic="http://schemas.openxmlformats.org/drawingml/2006/picture">
                   <pic:nvPicPr>
-                    <pic:cNvPr id="130896039" name="Imagen 130896039"/>
+                    <pic:cNvPr id="2" name="Diagrama ER de base de datos (pata de gallo).png"/>
                     <pic:cNvPicPr/>
                   </pic:nvPicPr>
-                  <pic:blipFill>
+                  <pic:blipFill rotWithShape="1">
                     <a:blip r:embed="rId20" cstate="print">
                       <a:extLst>
                         <a:ext uri="{28A0092B-C50C-407E-A947-70E740481C1C}">
@@ -12849,18 +12929,25 @@
                         </a:ext>
                       </a:extLst>
                     </a:blip>
-                    <a:stretch>
-                      <a:fillRect/>
-                    </a:stretch>
+                    <a:srcRect l="4394" t="4265" b="6389"/>
+                    <a:stretch/>
                   </pic:blipFill>
-                  <pic:spPr>
+                  <pic:spPr bwMode="auto">
                     <a:xfrm>
                       <a:off x="0" y="0"/>
-                      <a:ext cx="6070600" cy="4690745"/>
+                      <a:ext cx="5803900" cy="4191000"/>
                     </a:xfrm>
                     <a:prstGeom prst="rect">
                       <a:avLst/>
                     </a:prstGeom>
+                    <a:ln>
+                      <a:noFill/>
+                    </a:ln>
+                    <a:extLst>
+                      <a:ext uri="{53640926-AAD7-44D8-BBD7-CCE9431645EC}">
+                        <a14:shadowObscured xmlns:a14="http://schemas.microsoft.com/office/drawing/2010/main"/>
+                      </a:ext>
+                    </a:extLst>
                   </pic:spPr>
                 </pic:pic>
               </a:graphicData>
@@ -12868,6 +12955,8 @@
           </wp:inline>
         </w:drawing>
       </w:r>
+      <w:bookmarkStart w:id="1" w:name="_GoBack"/>
+      <w:bookmarkEnd w:id="1"/>
     </w:p>
     <w:p>
       <w:pPr>
@@ -13026,7 +13115,6 @@
           <w:szCs w:val="24"/>
           <w:lang w:val="es-ES"/>
         </w:rPr>
-        <w:lastRenderedPageBreak/>
         <w:t xml:space="preserve">2.5 Diccionario de Datos </w:t>
       </w:r>
     </w:p>
@@ -13075,10 +13163,12 @@
           <w:rFonts w:ascii="Times New Roman" w:hAnsi="Times New Roman" w:cs="Times New Roman"/>
           <w:b/>
           <w:bCs/>
-          <w:sz w:val="24"/>
-          <w:szCs w:val="24"/>
-          <w:lang w:val="es-ES"/>
-        </w:rPr>
+          <w:noProof/>
+          <w:sz w:val="24"/>
+          <w:szCs w:val="24"/>
+          <w:lang w:val="es-ES"/>
+        </w:rPr>
+        <w:lastRenderedPageBreak/>
         <w:drawing>
           <wp:inline distT="0" distB="0" distL="0" distR="0" wp14:anchorId="14551413" wp14:editId="70DD8DA0">
             <wp:extent cx="4887007" cy="1352739"/>
@@ -13161,6 +13251,7 @@
           <w:rFonts w:ascii="Times New Roman" w:hAnsi="Times New Roman" w:cs="Times New Roman"/>
           <w:b/>
           <w:bCs/>
+          <w:noProof/>
           <w:sz w:val="24"/>
           <w:szCs w:val="24"/>
           <w:lang w:val="es-ES"/>
@@ -13247,6 +13338,7 @@
           <w:rFonts w:ascii="Times New Roman" w:hAnsi="Times New Roman" w:cs="Times New Roman"/>
           <w:b/>
           <w:bCs/>
+          <w:noProof/>
           <w:sz w:val="24"/>
           <w:szCs w:val="24"/>
           <w:lang w:val="es-ES"/>
@@ -13333,6 +13425,7 @@
           <w:rFonts w:ascii="Times New Roman" w:hAnsi="Times New Roman" w:cs="Times New Roman"/>
           <w:b/>
           <w:bCs/>
+          <w:noProof/>
           <w:sz w:val="24"/>
           <w:szCs w:val="24"/>
           <w:lang w:val="es-ES"/>
@@ -13419,6 +13512,7 @@
           <w:rFonts w:ascii="Times New Roman" w:hAnsi="Times New Roman" w:cs="Times New Roman"/>
           <w:b/>
           <w:bCs/>
+          <w:noProof/>
           <w:sz w:val="24"/>
           <w:szCs w:val="24"/>
           <w:lang w:val="es-ES"/>
@@ -13505,6 +13599,7 @@
           <w:rFonts w:ascii="Times New Roman" w:hAnsi="Times New Roman" w:cs="Times New Roman"/>
           <w:b/>
           <w:bCs/>
+          <w:noProof/>
           <w:sz w:val="24"/>
           <w:szCs w:val="24"/>
           <w:lang w:val="es-ES"/>
@@ -13569,7 +13664,6 @@
           <w:szCs w:val="24"/>
           <w:lang w:val="es-ES"/>
         </w:rPr>
-        <w:lastRenderedPageBreak/>
         <w:t>Figura 15: Diccionario de Datos, Tabla Ventas</w:t>
       </w:r>
     </w:p>
@@ -13592,10 +13686,12 @@
           <w:rFonts w:ascii="Times New Roman" w:hAnsi="Times New Roman" w:cs="Times New Roman"/>
           <w:b/>
           <w:bCs/>
-          <w:sz w:val="24"/>
-          <w:szCs w:val="24"/>
-          <w:lang w:val="es-ES"/>
-        </w:rPr>
+          <w:noProof/>
+          <w:sz w:val="24"/>
+          <w:szCs w:val="24"/>
+          <w:lang w:val="es-ES"/>
+        </w:rPr>
+        <w:lastRenderedPageBreak/>
         <w:drawing>
           <wp:inline distT="0" distB="0" distL="0" distR="0" wp14:anchorId="381C83EA" wp14:editId="6D1E1986">
             <wp:extent cx="4991797" cy="1047896"/>
@@ -13678,6 +13774,7 @@
           <w:rFonts w:ascii="Times New Roman" w:hAnsi="Times New Roman" w:cs="Times New Roman"/>
           <w:b/>
           <w:bCs/>
+          <w:noProof/>
           <w:sz w:val="24"/>
           <w:szCs w:val="24"/>
           <w:lang w:val="es-ES"/>
@@ -13775,6 +13872,7 @@
           <w:rFonts w:ascii="Times New Roman" w:hAnsi="Times New Roman" w:cs="Times New Roman"/>
           <w:b/>
           <w:bCs/>
+          <w:noProof/>
           <w:sz w:val="24"/>
           <w:szCs w:val="24"/>
           <w:lang w:val="es-ES"/>
@@ -13861,6 +13959,7 @@
           <w:rFonts w:ascii="Times New Roman" w:hAnsi="Times New Roman" w:cs="Times New Roman"/>
           <w:b/>
           <w:bCs/>
+          <w:noProof/>
           <w:sz w:val="24"/>
           <w:szCs w:val="24"/>
           <w:lang w:val="es-ES"/>
@@ -13989,15 +14088,13 @@
           <w:rFonts w:ascii="Times New Roman" w:hAnsi="Times New Roman" w:cs="Times New Roman"/>
           <w:sz w:val="24"/>
           <w:szCs w:val="24"/>
-          <w:lang w:val="en-US"/>
-        </w:rPr>
-      </w:pPr>
-      <w:r>
-        <w:rPr>
-          <w:rFonts w:ascii="Times New Roman" w:hAnsi="Times New Roman" w:cs="Times New Roman"/>
-          <w:sz w:val="24"/>
-          <w:szCs w:val="24"/>
-          <w:lang w:val="en-US"/>
+        </w:rPr>
+      </w:pPr>
+      <w:r>
+        <w:rPr>
+          <w:rFonts w:ascii="Times New Roman" w:hAnsi="Times New Roman" w:cs="Times New Roman"/>
+          <w:sz w:val="24"/>
+          <w:szCs w:val="24"/>
         </w:rPr>
         <w:t xml:space="preserve">CREATE DATABASE </w:t>
       </w:r>
@@ -14007,18 +14104,8 @@
           <w:rFonts w:ascii="Times New Roman" w:hAnsi="Times New Roman" w:cs="Times New Roman"/>
           <w:sz w:val="24"/>
           <w:szCs w:val="24"/>
-          <w:lang w:val="en-US"/>
-        </w:rPr>
-        <w:t>Hotel</w:t>
-      </w:r>
-      <w:r>
-        <w:rPr>
-          <w:rFonts w:ascii="Times New Roman" w:hAnsi="Times New Roman" w:cs="Times New Roman"/>
-          <w:sz w:val="24"/>
-          <w:szCs w:val="24"/>
-          <w:lang w:val="en-US"/>
-        </w:rPr>
-        <w:t>ixHub</w:t>
+        </w:rPr>
+        <w:t>HotelixHub</w:t>
       </w:r>
       <w:proofErr w:type="spellEnd"/>
       <w:r>
@@ -14026,7 +14113,6 @@
           <w:rFonts w:ascii="Times New Roman" w:hAnsi="Times New Roman" w:cs="Times New Roman"/>
           <w:sz w:val="24"/>
           <w:szCs w:val="24"/>
-          <w:lang w:val="en-US"/>
         </w:rPr>
         <w:t>;</w:t>
       </w:r>
@@ -14121,7 +14207,27 @@
           <w:szCs w:val="24"/>
           <w:lang w:val="en-US"/>
         </w:rPr>
-        <w:t xml:space="preserve"> Rol---</w:t>
+        <w:t xml:space="preserve"> </w:t>
+      </w:r>
+      <w:proofErr w:type="spellStart"/>
+      <w:r>
+        <w:rPr>
+          <w:rFonts w:ascii="Times New Roman" w:hAnsi="Times New Roman" w:cs="Times New Roman"/>
+          <w:sz w:val="24"/>
+          <w:szCs w:val="24"/>
+          <w:lang w:val="en-US"/>
+        </w:rPr>
+        <w:t>Rol</w:t>
+      </w:r>
+      <w:proofErr w:type="spellEnd"/>
+      <w:r>
+        <w:rPr>
+          <w:rFonts w:ascii="Times New Roman" w:hAnsi="Times New Roman" w:cs="Times New Roman"/>
+          <w:sz w:val="24"/>
+          <w:szCs w:val="24"/>
+          <w:lang w:val="en-US"/>
+        </w:rPr>
+        <w:t>---</w:t>
       </w:r>
     </w:p>
     <w:p>
@@ -14227,7 +14333,27 @@
           <w:szCs w:val="24"/>
           <w:lang w:val="es-ES"/>
         </w:rPr>
-        <w:t xml:space="preserve"> VARCHAR(11)</w:t>
+        <w:t xml:space="preserve"> </w:t>
+      </w:r>
+      <w:proofErr w:type="gramStart"/>
+      <w:r>
+        <w:rPr>
+          <w:rFonts w:ascii="Times New Roman" w:hAnsi="Times New Roman" w:cs="Times New Roman"/>
+          <w:sz w:val="24"/>
+          <w:szCs w:val="24"/>
+          <w:lang w:val="es-ES"/>
+        </w:rPr>
+        <w:t>VARCHAR(</w:t>
+      </w:r>
+      <w:proofErr w:type="gramEnd"/>
+      <w:r>
+        <w:rPr>
+          <w:rFonts w:ascii="Times New Roman" w:hAnsi="Times New Roman" w:cs="Times New Roman"/>
+          <w:sz w:val="24"/>
+          <w:szCs w:val="24"/>
+          <w:lang w:val="es-ES"/>
+        </w:rPr>
+        <w:t>11)</w:t>
       </w:r>
     </w:p>
     <w:p>
@@ -14271,7 +14397,6 @@
           <w:szCs w:val="24"/>
           <w:lang w:val="es-ES"/>
         </w:rPr>
-        <w:lastRenderedPageBreak/>
         <w:t>-- Tabla Nacionalidad</w:t>
       </w:r>
       <w:r>
@@ -14303,6 +14428,7 @@
           <w:szCs w:val="24"/>
           <w:lang w:val="es-ES"/>
         </w:rPr>
+        <w:lastRenderedPageBreak/>
         <w:t>CREATE TABLE Nacionalidad (</w:t>
       </w:r>
     </w:p>
@@ -14387,7 +14513,27 @@
           <w:szCs w:val="24"/>
           <w:lang w:val="es-ES"/>
         </w:rPr>
-        <w:t xml:space="preserve"> VARCHAR(500)</w:t>
+        <w:t xml:space="preserve"> </w:t>
+      </w:r>
+      <w:proofErr w:type="gramStart"/>
+      <w:r>
+        <w:rPr>
+          <w:rFonts w:ascii="Times New Roman" w:hAnsi="Times New Roman" w:cs="Times New Roman"/>
+          <w:sz w:val="24"/>
+          <w:szCs w:val="24"/>
+          <w:lang w:val="es-ES"/>
+        </w:rPr>
+        <w:t>VARCHAR(</w:t>
+      </w:r>
+      <w:proofErr w:type="gramEnd"/>
+      <w:r>
+        <w:rPr>
+          <w:rFonts w:ascii="Times New Roman" w:hAnsi="Times New Roman" w:cs="Times New Roman"/>
+          <w:sz w:val="24"/>
+          <w:szCs w:val="24"/>
+          <w:lang w:val="es-ES"/>
+        </w:rPr>
+        <w:t>500)</w:t>
       </w:r>
     </w:p>
     <w:p>
@@ -14588,7 +14734,27 @@
           <w:szCs w:val="24"/>
           <w:lang w:val="es-ES"/>
         </w:rPr>
-        <w:t xml:space="preserve"> VARCHAR(100),</w:t>
+        <w:t xml:space="preserve"> </w:t>
+      </w:r>
+      <w:proofErr w:type="gramStart"/>
+      <w:r>
+        <w:rPr>
+          <w:rFonts w:ascii="Times New Roman" w:hAnsi="Times New Roman" w:cs="Times New Roman"/>
+          <w:sz w:val="24"/>
+          <w:szCs w:val="24"/>
+          <w:lang w:val="es-ES"/>
+        </w:rPr>
+        <w:t>VARCHAR(</w:t>
+      </w:r>
+      <w:proofErr w:type="gramEnd"/>
+      <w:r>
+        <w:rPr>
+          <w:rFonts w:ascii="Times New Roman" w:hAnsi="Times New Roman" w:cs="Times New Roman"/>
+          <w:sz w:val="24"/>
+          <w:szCs w:val="24"/>
+          <w:lang w:val="es-ES"/>
+        </w:rPr>
+        <w:t>100),</w:t>
       </w:r>
     </w:p>
     <w:p>
@@ -14630,7 +14796,27 @@
           <w:szCs w:val="24"/>
           <w:lang w:val="es-ES"/>
         </w:rPr>
-        <w:t xml:space="preserve"> VARCHAR(50),</w:t>
+        <w:t xml:space="preserve"> </w:t>
+      </w:r>
+      <w:proofErr w:type="gramStart"/>
+      <w:r>
+        <w:rPr>
+          <w:rFonts w:ascii="Times New Roman" w:hAnsi="Times New Roman" w:cs="Times New Roman"/>
+          <w:sz w:val="24"/>
+          <w:szCs w:val="24"/>
+          <w:lang w:val="es-ES"/>
+        </w:rPr>
+        <w:t>VARCHAR(</w:t>
+      </w:r>
+      <w:proofErr w:type="gramEnd"/>
+      <w:r>
+        <w:rPr>
+          <w:rFonts w:ascii="Times New Roman" w:hAnsi="Times New Roman" w:cs="Times New Roman"/>
+          <w:sz w:val="24"/>
+          <w:szCs w:val="24"/>
+          <w:lang w:val="es-ES"/>
+        </w:rPr>
+        <w:t>50),</w:t>
       </w:r>
     </w:p>
     <w:p>
@@ -14672,7 +14858,27 @@
           <w:szCs w:val="24"/>
           <w:lang w:val="es-ES"/>
         </w:rPr>
-        <w:t xml:space="preserve"> VARCHAR(100),</w:t>
+        <w:t xml:space="preserve"> </w:t>
+      </w:r>
+      <w:proofErr w:type="gramStart"/>
+      <w:r>
+        <w:rPr>
+          <w:rFonts w:ascii="Times New Roman" w:hAnsi="Times New Roman" w:cs="Times New Roman"/>
+          <w:sz w:val="24"/>
+          <w:szCs w:val="24"/>
+          <w:lang w:val="es-ES"/>
+        </w:rPr>
+        <w:t>VARCHAR(</w:t>
+      </w:r>
+      <w:proofErr w:type="gramEnd"/>
+      <w:r>
+        <w:rPr>
+          <w:rFonts w:ascii="Times New Roman" w:hAnsi="Times New Roman" w:cs="Times New Roman"/>
+          <w:sz w:val="24"/>
+          <w:szCs w:val="24"/>
+          <w:lang w:val="es-ES"/>
+        </w:rPr>
+        <w:t>100),</w:t>
       </w:r>
     </w:p>
     <w:p>
@@ -14756,7 +14962,27 @@
           <w:szCs w:val="24"/>
           <w:lang w:val="en-US"/>
         </w:rPr>
-        <w:t>) REFERENCES Rol(</w:t>
+        <w:t xml:space="preserve">) REFERENCES </w:t>
+      </w:r>
+      <w:proofErr w:type="spellStart"/>
+      <w:r>
+        <w:rPr>
+          <w:rFonts w:ascii="Times New Roman" w:hAnsi="Times New Roman" w:cs="Times New Roman"/>
+          <w:sz w:val="24"/>
+          <w:szCs w:val="24"/>
+          <w:lang w:val="en-US"/>
+        </w:rPr>
+        <w:t>Rol</w:t>
+      </w:r>
+      <w:proofErr w:type="spellEnd"/>
+      <w:r>
+        <w:rPr>
+          <w:rFonts w:ascii="Times New Roman" w:hAnsi="Times New Roman" w:cs="Times New Roman"/>
+          <w:sz w:val="24"/>
+          <w:szCs w:val="24"/>
+          <w:lang w:val="en-US"/>
+        </w:rPr>
+        <w:t>(</w:t>
       </w:r>
       <w:proofErr w:type="spellStart"/>
       <w:r>
@@ -15057,7 +15283,27 @@
           <w:szCs w:val="24"/>
           <w:lang w:val="es-ES"/>
         </w:rPr>
-        <w:t xml:space="preserve"> VARCHAR(50)</w:t>
+        <w:t xml:space="preserve"> </w:t>
+      </w:r>
+      <w:proofErr w:type="gramStart"/>
+      <w:r>
+        <w:rPr>
+          <w:rFonts w:ascii="Times New Roman" w:hAnsi="Times New Roman" w:cs="Times New Roman"/>
+          <w:sz w:val="24"/>
+          <w:szCs w:val="24"/>
+          <w:lang w:val="es-ES"/>
+        </w:rPr>
+        <w:t>VARCHAR(</w:t>
+      </w:r>
+      <w:proofErr w:type="gramEnd"/>
+      <w:r>
+        <w:rPr>
+          <w:rFonts w:ascii="Times New Roman" w:hAnsi="Times New Roman" w:cs="Times New Roman"/>
+          <w:sz w:val="24"/>
+          <w:szCs w:val="24"/>
+          <w:lang w:val="es-ES"/>
+        </w:rPr>
+        <w:t>50)</w:t>
       </w:r>
     </w:p>
     <w:p>
@@ -15122,17 +15368,37 @@
           <w:rFonts w:ascii="Times New Roman" w:hAnsi="Times New Roman" w:cs="Times New Roman"/>
           <w:sz w:val="24"/>
           <w:szCs w:val="24"/>
-          <w:lang w:val="es-ES"/>
-        </w:rPr>
-      </w:pPr>
-      <w:r>
-        <w:rPr>
-          <w:rFonts w:ascii="Times New Roman" w:hAnsi="Times New Roman" w:cs="Times New Roman"/>
-          <w:sz w:val="24"/>
-          <w:szCs w:val="24"/>
-          <w:lang w:val="es-ES"/>
-        </w:rPr>
-        <w:t>CREATE TABLE Producto (</w:t>
+          <w:lang w:val="en-US"/>
+        </w:rPr>
+      </w:pPr>
+      <w:r>
+        <w:rPr>
+          <w:rFonts w:ascii="Times New Roman" w:hAnsi="Times New Roman" w:cs="Times New Roman"/>
+          <w:sz w:val="24"/>
+          <w:szCs w:val="24"/>
+          <w:lang w:val="en-US"/>
+        </w:rPr>
+        <w:t xml:space="preserve">CREATE TABLE </w:t>
+      </w:r>
+      <w:proofErr w:type="spellStart"/>
+      <w:r>
+        <w:rPr>
+          <w:rFonts w:ascii="Times New Roman" w:hAnsi="Times New Roman" w:cs="Times New Roman"/>
+          <w:sz w:val="24"/>
+          <w:szCs w:val="24"/>
+          <w:lang w:val="en-US"/>
+        </w:rPr>
+        <w:t>Producto</w:t>
+      </w:r>
+      <w:proofErr w:type="spellEnd"/>
+      <w:r>
+        <w:rPr>
+          <w:rFonts w:ascii="Times New Roman" w:hAnsi="Times New Roman" w:cs="Times New Roman"/>
+          <w:sz w:val="24"/>
+          <w:szCs w:val="24"/>
+          <w:lang w:val="en-US"/>
+        </w:rPr>
+        <w:t xml:space="preserve"> (</w:t>
       </w:r>
     </w:p>
     <w:p>
@@ -15152,7 +15418,7 @@
           <w:rFonts w:ascii="Times New Roman" w:hAnsi="Times New Roman" w:cs="Times New Roman"/>
           <w:sz w:val="24"/>
           <w:szCs w:val="24"/>
-          <w:lang w:val="es-ES"/>
+          <w:lang w:val="en-US"/>
         </w:rPr>
         <w:t xml:space="preserve">    </w:t>
       </w:r>
@@ -15216,7 +15482,27 @@
           <w:szCs w:val="24"/>
           <w:lang w:val="es-ES"/>
         </w:rPr>
-        <w:t xml:space="preserve"> VARCHAR(50),</w:t>
+        <w:t xml:space="preserve"> </w:t>
+      </w:r>
+      <w:proofErr w:type="gramStart"/>
+      <w:r>
+        <w:rPr>
+          <w:rFonts w:ascii="Times New Roman" w:hAnsi="Times New Roman" w:cs="Times New Roman"/>
+          <w:sz w:val="24"/>
+          <w:szCs w:val="24"/>
+          <w:lang w:val="es-ES"/>
+        </w:rPr>
+        <w:t>VARCHAR(</w:t>
+      </w:r>
+      <w:proofErr w:type="gramEnd"/>
+      <w:r>
+        <w:rPr>
+          <w:rFonts w:ascii="Times New Roman" w:hAnsi="Times New Roman" w:cs="Times New Roman"/>
+          <w:sz w:val="24"/>
+          <w:szCs w:val="24"/>
+          <w:lang w:val="es-ES"/>
+        </w:rPr>
+        <w:t>50),</w:t>
       </w:r>
     </w:p>
     <w:p>
@@ -15258,7 +15544,27 @@
           <w:szCs w:val="24"/>
           <w:lang w:val="es-ES"/>
         </w:rPr>
-        <w:t xml:space="preserve"> VARCHAR(50),</w:t>
+        <w:t xml:space="preserve"> </w:t>
+      </w:r>
+      <w:proofErr w:type="gramStart"/>
+      <w:r>
+        <w:rPr>
+          <w:rFonts w:ascii="Times New Roman" w:hAnsi="Times New Roman" w:cs="Times New Roman"/>
+          <w:sz w:val="24"/>
+          <w:szCs w:val="24"/>
+          <w:lang w:val="es-ES"/>
+        </w:rPr>
+        <w:t>VARCHAR(</w:t>
+      </w:r>
+      <w:proofErr w:type="gramEnd"/>
+      <w:r>
+        <w:rPr>
+          <w:rFonts w:ascii="Times New Roman" w:hAnsi="Times New Roman" w:cs="Times New Roman"/>
+          <w:sz w:val="24"/>
+          <w:szCs w:val="24"/>
+          <w:lang w:val="es-ES"/>
+        </w:rPr>
+        <w:t>50),</w:t>
       </w:r>
     </w:p>
     <w:p>
@@ -15300,7 +15606,27 @@
           <w:szCs w:val="24"/>
           <w:lang w:val="en-US"/>
         </w:rPr>
-        <w:t xml:space="preserve"> DECIMAL(10,2),</w:t>
+        <w:t xml:space="preserve"> </w:t>
+      </w:r>
+      <w:proofErr w:type="gramStart"/>
+      <w:r>
+        <w:rPr>
+          <w:rFonts w:ascii="Times New Roman" w:hAnsi="Times New Roman" w:cs="Times New Roman"/>
+          <w:sz w:val="24"/>
+          <w:szCs w:val="24"/>
+          <w:lang w:val="en-US"/>
+        </w:rPr>
+        <w:t>DECIMAL(</w:t>
+      </w:r>
+      <w:proofErr w:type="gramEnd"/>
+      <w:r>
+        <w:rPr>
+          <w:rFonts w:ascii="Times New Roman" w:hAnsi="Times New Roman" w:cs="Times New Roman"/>
+          <w:sz w:val="24"/>
+          <w:szCs w:val="24"/>
+          <w:lang w:val="en-US"/>
+        </w:rPr>
+        <w:t>10,2),</w:t>
       </w:r>
     </w:p>
     <w:p>
@@ -15481,7 +15807,6 @@
           <w:szCs w:val="24"/>
           <w:lang w:val="es-ES"/>
         </w:rPr>
-        <w:lastRenderedPageBreak/>
         <w:t>-- Tabla Venta</w:t>
       </w:r>
       <w:r>
@@ -15513,6 +15838,7 @@
           <w:szCs w:val="24"/>
           <w:lang w:val="es-ES"/>
         </w:rPr>
+        <w:lastRenderedPageBreak/>
         <w:t>CREATE TABLE Venta (</w:t>
       </w:r>
     </w:p>
@@ -15661,7 +15987,27 @@
           <w:szCs w:val="24"/>
           <w:lang w:val="es-ES"/>
         </w:rPr>
-        <w:t xml:space="preserve">    total DECIMAL(10,2),</w:t>
+        <w:t xml:space="preserve">    total </w:t>
+      </w:r>
+      <w:proofErr w:type="gramStart"/>
+      <w:r>
+        <w:rPr>
+          <w:rFonts w:ascii="Times New Roman" w:hAnsi="Times New Roman" w:cs="Times New Roman"/>
+          <w:sz w:val="24"/>
+          <w:szCs w:val="24"/>
+          <w:lang w:val="es-ES"/>
+        </w:rPr>
+        <w:t>DECIMAL(</w:t>
+      </w:r>
+      <w:proofErr w:type="gramEnd"/>
+      <w:r>
+        <w:rPr>
+          <w:rFonts w:ascii="Times New Roman" w:hAnsi="Times New Roman" w:cs="Times New Roman"/>
+          <w:sz w:val="24"/>
+          <w:szCs w:val="24"/>
+          <w:lang w:val="es-ES"/>
+        </w:rPr>
+        <w:t>10,2),</w:t>
       </w:r>
     </w:p>
     <w:p>
@@ -16019,7 +16365,27 @@
           <w:szCs w:val="24"/>
           <w:lang w:val="es-ES"/>
         </w:rPr>
-        <w:t xml:space="preserve"> DECIMAL(10,2),</w:t>
+        <w:t xml:space="preserve"> </w:t>
+      </w:r>
+      <w:proofErr w:type="gramStart"/>
+      <w:r>
+        <w:rPr>
+          <w:rFonts w:ascii="Times New Roman" w:hAnsi="Times New Roman" w:cs="Times New Roman"/>
+          <w:sz w:val="24"/>
+          <w:szCs w:val="24"/>
+          <w:lang w:val="es-ES"/>
+        </w:rPr>
+        <w:t>DECIMAL(</w:t>
+      </w:r>
+      <w:proofErr w:type="gramEnd"/>
+      <w:r>
+        <w:rPr>
+          <w:rFonts w:ascii="Times New Roman" w:hAnsi="Times New Roman" w:cs="Times New Roman"/>
+          <w:sz w:val="24"/>
+          <w:szCs w:val="24"/>
+          <w:lang w:val="es-ES"/>
+        </w:rPr>
+        <w:t>10,2),</w:t>
       </w:r>
     </w:p>
     <w:p>
@@ -16041,7 +16407,27 @@
           <w:szCs w:val="24"/>
           <w:lang w:val="es-ES"/>
         </w:rPr>
-        <w:t xml:space="preserve">    subtotal DECIMAL(10,2),</w:t>
+        <w:t xml:space="preserve">    subtotal </w:t>
+      </w:r>
+      <w:proofErr w:type="gramStart"/>
+      <w:r>
+        <w:rPr>
+          <w:rFonts w:ascii="Times New Roman" w:hAnsi="Times New Roman" w:cs="Times New Roman"/>
+          <w:sz w:val="24"/>
+          <w:szCs w:val="24"/>
+          <w:lang w:val="es-ES"/>
+        </w:rPr>
+        <w:t>DECIMAL(</w:t>
+      </w:r>
+      <w:proofErr w:type="gramEnd"/>
+      <w:r>
+        <w:rPr>
+          <w:rFonts w:ascii="Times New Roman" w:hAnsi="Times New Roman" w:cs="Times New Roman"/>
+          <w:sz w:val="24"/>
+          <w:szCs w:val="24"/>
+          <w:lang w:val="es-ES"/>
+        </w:rPr>
+        <w:t>10,2),</w:t>
       </w:r>
     </w:p>
     <w:p>
@@ -16397,7 +16783,27 @@
           <w:szCs w:val="24"/>
           <w:lang w:val="es-ES"/>
         </w:rPr>
-        <w:t xml:space="preserve"> VARCHAR(20)</w:t>
+        <w:t xml:space="preserve"> </w:t>
+      </w:r>
+      <w:proofErr w:type="gramStart"/>
+      <w:r>
+        <w:rPr>
+          <w:rFonts w:ascii="Times New Roman" w:hAnsi="Times New Roman" w:cs="Times New Roman"/>
+          <w:sz w:val="24"/>
+          <w:szCs w:val="24"/>
+          <w:lang w:val="es-ES"/>
+        </w:rPr>
+        <w:t>VARCHAR(</w:t>
+      </w:r>
+      <w:proofErr w:type="gramEnd"/>
+      <w:r>
+        <w:rPr>
+          <w:rFonts w:ascii="Times New Roman" w:hAnsi="Times New Roman" w:cs="Times New Roman"/>
+          <w:sz w:val="24"/>
+          <w:szCs w:val="24"/>
+          <w:lang w:val="es-ES"/>
+        </w:rPr>
+        <w:t>20)</w:t>
       </w:r>
     </w:p>
     <w:p>
@@ -16662,7 +17068,27 @@
           <w:szCs w:val="24"/>
           <w:lang w:val="es-ES"/>
         </w:rPr>
-        <w:t xml:space="preserve"> ENUM('disponible', 'ocupada', 'mantenimiento'),</w:t>
+        <w:t xml:space="preserve"> </w:t>
+      </w:r>
+      <w:proofErr w:type="gramStart"/>
+      <w:r>
+        <w:rPr>
+          <w:rFonts w:ascii="Times New Roman" w:hAnsi="Times New Roman" w:cs="Times New Roman"/>
+          <w:sz w:val="24"/>
+          <w:szCs w:val="24"/>
+          <w:lang w:val="es-ES"/>
+        </w:rPr>
+        <w:t>ENUM(</w:t>
+      </w:r>
+      <w:proofErr w:type="gramEnd"/>
+      <w:r>
+        <w:rPr>
+          <w:rFonts w:ascii="Times New Roman" w:hAnsi="Times New Roman" w:cs="Times New Roman"/>
+          <w:sz w:val="24"/>
+          <w:szCs w:val="24"/>
+          <w:lang w:val="es-ES"/>
+        </w:rPr>
+        <w:t>'disponible', 'ocupada', 'mantenimiento'),</w:t>
       </w:r>
     </w:p>
     <w:p>
@@ -16684,7 +17110,6 @@
           <w:szCs w:val="24"/>
           <w:lang w:val="es-ES"/>
         </w:rPr>
-        <w:lastRenderedPageBreak/>
         <w:t xml:space="preserve">    FOREIGN KEY (</w:t>
       </w:r>
       <w:proofErr w:type="spellStart"/>
@@ -16767,6 +17192,7 @@
           <w:szCs w:val="24"/>
           <w:lang w:val="en-US"/>
         </w:rPr>
+        <w:lastRenderedPageBreak/>
         <w:t>);</w:t>
       </w:r>
     </w:p>
@@ -17081,7 +17507,27 @@
           <w:szCs w:val="24"/>
           <w:lang w:val="es-ES"/>
         </w:rPr>
-        <w:t xml:space="preserve"> ENUM('pendiente', 'confirmada', 'cancelada'),</w:t>
+        <w:t xml:space="preserve"> </w:t>
+      </w:r>
+      <w:proofErr w:type="gramStart"/>
+      <w:r>
+        <w:rPr>
+          <w:rFonts w:ascii="Times New Roman" w:hAnsi="Times New Roman" w:cs="Times New Roman"/>
+          <w:sz w:val="24"/>
+          <w:szCs w:val="24"/>
+          <w:lang w:val="es-ES"/>
+        </w:rPr>
+        <w:t>ENUM(</w:t>
+      </w:r>
+      <w:proofErr w:type="gramEnd"/>
+      <w:r>
+        <w:rPr>
+          <w:rFonts w:ascii="Times New Roman" w:hAnsi="Times New Roman" w:cs="Times New Roman"/>
+          <w:sz w:val="24"/>
+          <w:szCs w:val="24"/>
+          <w:lang w:val="es-ES"/>
+        </w:rPr>
+        <w:t>'pendiente', 'confirmada', 'cancelada'),</w:t>
       </w:r>
     </w:p>
     <w:p>
@@ -17373,16 +17819,7 @@
           <w:szCs w:val="24"/>
           <w:lang w:val="es-ES"/>
         </w:rPr>
-        <w:t>);</w:t>
-      </w:r>
-      <w:r>
-        <w:rPr>
-          <w:rFonts w:ascii="Times New Roman" w:hAnsi="Times New Roman" w:cs="Times New Roman"/>
-          <w:sz w:val="24"/>
-          <w:szCs w:val="24"/>
-          <w:lang w:val="es-ES"/>
-        </w:rPr>
-        <w:t xml:space="preserve"> </w:t>
+        <w:t xml:space="preserve">); </w:t>
       </w:r>
     </w:p>
     <w:p>
@@ -19056,7 +19493,7 @@
 </file>
 
 <file path=word/numbering.xml><?xml version="1.0" encoding="utf-8"?>
-<w:numbering xmlns:wpc="http://schemas.microsoft.com/office/word/2010/wordprocessingCanvas" xmlns:cx="http://schemas.microsoft.com/office/drawing/2014/chartex" xmlns:cx1="http://schemas.microsoft.com/office/drawing/2015/9/8/chartex" xmlns:cx2="http://schemas.microsoft.com/office/drawing/2015/10/21/chartex" xmlns:cx3="http://schemas.microsoft.com/office/drawing/2016/5/9/chartex" xmlns:cx4="http://schemas.microsoft.com/office/drawing/2016/5/10/chartex" xmlns:cx5="http://schemas.microsoft.com/office/drawing/2016/5/11/chartex" xmlns:cx6="http://schemas.microsoft.com/office/drawing/2016/5/12/chartex" xmlns:cx7="http://schemas.microsoft.com/office/drawing/2016/5/13/chartex" xmlns:cx8="http://schemas.microsoft.com/office/drawing/2016/5/14/chartex" xmlns:mc="http://schemas.openxmlformats.org/markup-compatibility/2006" xmlns:aink="http://schemas.microsoft.com/office/drawing/2016/ink" xmlns:am3d="http://schemas.microsoft.com/office/drawing/2017/model3d" xmlns:o="urn:schemas-microsoft-com:office:office" xmlns:oel="http://schemas.microsoft.com/office/2019/extlst" xmlns:r="http://schemas.openxmlformats.org/officeDocument/2006/relationships" xmlns:m="http://schemas.openxmlformats.org/officeDocument/2006/math" xmlns:v="urn:schemas-microsoft-com:vml" xmlns:wp14="http://schemas.microsoft.com/office/word/2010/wordprocessingDrawing" xmlns:wp="http://schemas.openxmlformats.org/drawingml/2006/wordprocessingDrawing" xmlns:w10="urn:schemas-microsoft-com:office:word" xmlns:w="http://schemas.openxmlformats.org/wordprocessingml/2006/main" xmlns:w14="http://schemas.microsoft.com/office/word/2010/wordml" xmlns:w15="http://schemas.microsoft.com/office/word/2012/wordml" xmlns:w16cex="http://schemas.microsoft.com/office/word/2018/wordml/cex" xmlns:w16cid="http://schemas.microsoft.com/office/word/2016/wordml/cid" xmlns:w16="http://schemas.microsoft.com/office/word/2018/wordml" xmlns:w16du="http://schemas.microsoft.com/office/word/2023/wordml/word16du" xmlns:w16sdtdh="http://schemas.microsoft.com/office/word/2020/wordml/sdtdatahash" xmlns:w16sdtfl="http://schemas.microsoft.com/office/word/2024/wordml/sdtformatlock" xmlns:w16se="http://schemas.microsoft.com/office/word/2015/wordml/symex" xmlns:wpg="http://schemas.microsoft.com/office/word/2010/wordprocessingGroup" xmlns:wpi="http://schemas.microsoft.com/office/word/2010/wordprocessingInk" xmlns:wne="http://schemas.microsoft.com/office/word/2006/wordml" xmlns:wps="http://schemas.microsoft.com/office/word/2010/wordprocessingShape" mc:Ignorable="w14 w15 w16se w16cid w16 w16cex w16sdtdh w16sdtfl w16du wp14">
+<w:numbering xmlns:wpc="http://schemas.microsoft.com/office/word/2010/wordprocessingCanvas" xmlns:cx="http://schemas.microsoft.com/office/drawing/2014/chartex" xmlns:cx1="http://schemas.microsoft.com/office/drawing/2015/9/8/chartex" xmlns:cx2="http://schemas.microsoft.com/office/drawing/2015/10/21/chartex" xmlns:cx3="http://schemas.microsoft.com/office/drawing/2016/5/9/chartex" xmlns:cx4="http://schemas.microsoft.com/office/drawing/2016/5/10/chartex" xmlns:cx5="http://schemas.microsoft.com/office/drawing/2016/5/11/chartex" xmlns:cx6="http://schemas.microsoft.com/office/drawing/2016/5/12/chartex" xmlns:cx7="http://schemas.microsoft.com/office/drawing/2016/5/13/chartex" xmlns:cx8="http://schemas.microsoft.com/office/drawing/2016/5/14/chartex" xmlns:mc="http://schemas.openxmlformats.org/markup-compatibility/2006" xmlns:aink="http://schemas.microsoft.com/office/drawing/2016/ink" xmlns:am3d="http://schemas.microsoft.com/office/drawing/2017/model3d" xmlns:o="urn:schemas-microsoft-com:office:office" xmlns:r="http://schemas.openxmlformats.org/officeDocument/2006/relationships" xmlns:m="http://schemas.openxmlformats.org/officeDocument/2006/math" xmlns:v="urn:schemas-microsoft-com:vml" xmlns:wp14="http://schemas.microsoft.com/office/word/2010/wordprocessingDrawing" xmlns:wp="http://schemas.openxmlformats.org/drawingml/2006/wordprocessingDrawing" xmlns:w10="urn:schemas-microsoft-com:office:word" xmlns:w="http://schemas.openxmlformats.org/wordprocessingml/2006/main" xmlns:w14="http://schemas.microsoft.com/office/word/2010/wordml" xmlns:w15="http://schemas.microsoft.com/office/word/2012/wordml" xmlns:w16cid="http://schemas.microsoft.com/office/word/2016/wordml/cid" xmlns:w16se="http://schemas.microsoft.com/office/word/2015/wordml/symex" xmlns:wpg="http://schemas.microsoft.com/office/word/2010/wordprocessingGroup" xmlns:wpi="http://schemas.microsoft.com/office/word/2010/wordprocessingInk" xmlns:wne="http://schemas.microsoft.com/office/word/2006/wordml" xmlns:wps="http://schemas.microsoft.com/office/word/2010/wordprocessingShape" mc:Ignorable="w14 w15 w16se w16cid wp14">
   <w:abstractNum w:abstractNumId="0" w15:restartNumberingAfterBreak="0">
     <w:nsid w:val="08DB6A2F"/>
     <w:multiLevelType w:val="multilevel"/>
@@ -21193,13 +21630,13 @@
       </w:rPr>
     </w:lvl>
   </w:abstractNum>
-  <w:num w:numId="1" w16cid:durableId="202593473">
+  <w:num w:numId="1">
     <w:abstractNumId w:val="3"/>
   </w:num>
-  <w:num w:numId="2" w16cid:durableId="491719326">
+  <w:num w:numId="2">
     <w:abstractNumId w:val="7"/>
   </w:num>
-  <w:num w:numId="3" w16cid:durableId="1540556551">
+  <w:num w:numId="3">
     <w:abstractNumId w:val="15"/>
     <w:lvlOverride w:ilvl="0">
       <w:startOverride w:val="1"/>
@@ -21229,91 +21666,28 @@
       <w:startOverride w:val="1"/>
     </w:lvlOverride>
   </w:num>
-  <w:num w:numId="4" w16cid:durableId="1628194634">
+  <w:num w:numId="4">
     <w:abstractNumId w:val="0"/>
-    <w:lvlOverride w:ilvl="0"/>
-    <w:lvlOverride w:ilvl="1"/>
-    <w:lvlOverride w:ilvl="2"/>
-    <w:lvlOverride w:ilvl="3"/>
-    <w:lvlOverride w:ilvl="4"/>
-    <w:lvlOverride w:ilvl="5"/>
-    <w:lvlOverride w:ilvl="6"/>
-    <w:lvlOverride w:ilvl="7"/>
-    <w:lvlOverride w:ilvl="8"/>
   </w:num>
-  <w:num w:numId="5" w16cid:durableId="2040544213">
+  <w:num w:numId="5">
     <w:abstractNumId w:val="19"/>
-    <w:lvlOverride w:ilvl="0"/>
-    <w:lvlOverride w:ilvl="1"/>
-    <w:lvlOverride w:ilvl="2"/>
-    <w:lvlOverride w:ilvl="3"/>
-    <w:lvlOverride w:ilvl="4"/>
-    <w:lvlOverride w:ilvl="5"/>
-    <w:lvlOverride w:ilvl="6"/>
-    <w:lvlOverride w:ilvl="7"/>
-    <w:lvlOverride w:ilvl="8"/>
   </w:num>
-  <w:num w:numId="6" w16cid:durableId="2147241491">
+  <w:num w:numId="6">
     <w:abstractNumId w:val="16"/>
-    <w:lvlOverride w:ilvl="0"/>
-    <w:lvlOverride w:ilvl="1"/>
-    <w:lvlOverride w:ilvl="2"/>
-    <w:lvlOverride w:ilvl="3"/>
-    <w:lvlOverride w:ilvl="4"/>
-    <w:lvlOverride w:ilvl="5"/>
-    <w:lvlOverride w:ilvl="6"/>
-    <w:lvlOverride w:ilvl="7"/>
-    <w:lvlOverride w:ilvl="8"/>
   </w:num>
-  <w:num w:numId="7" w16cid:durableId="1606501781">
+  <w:num w:numId="7">
     <w:abstractNumId w:val="8"/>
-    <w:lvlOverride w:ilvl="0"/>
-    <w:lvlOverride w:ilvl="1"/>
-    <w:lvlOverride w:ilvl="2"/>
-    <w:lvlOverride w:ilvl="3"/>
-    <w:lvlOverride w:ilvl="4"/>
-    <w:lvlOverride w:ilvl="5"/>
-    <w:lvlOverride w:ilvl="6"/>
-    <w:lvlOverride w:ilvl="7"/>
-    <w:lvlOverride w:ilvl="8"/>
   </w:num>
-  <w:num w:numId="8" w16cid:durableId="218639118">
+  <w:num w:numId="8">
     <w:abstractNumId w:val="6"/>
-    <w:lvlOverride w:ilvl="0"/>
-    <w:lvlOverride w:ilvl="1"/>
-    <w:lvlOverride w:ilvl="2"/>
-    <w:lvlOverride w:ilvl="3"/>
-    <w:lvlOverride w:ilvl="4"/>
-    <w:lvlOverride w:ilvl="5"/>
-    <w:lvlOverride w:ilvl="6"/>
-    <w:lvlOverride w:ilvl="7"/>
-    <w:lvlOverride w:ilvl="8"/>
   </w:num>
-  <w:num w:numId="9" w16cid:durableId="118381910">
+  <w:num w:numId="9">
     <w:abstractNumId w:val="10"/>
-    <w:lvlOverride w:ilvl="0"/>
-    <w:lvlOverride w:ilvl="1"/>
-    <w:lvlOverride w:ilvl="2"/>
-    <w:lvlOverride w:ilvl="3"/>
-    <w:lvlOverride w:ilvl="4"/>
-    <w:lvlOverride w:ilvl="5"/>
-    <w:lvlOverride w:ilvl="6"/>
-    <w:lvlOverride w:ilvl="7"/>
-    <w:lvlOverride w:ilvl="8"/>
   </w:num>
-  <w:num w:numId="10" w16cid:durableId="285089104">
+  <w:num w:numId="10">
     <w:abstractNumId w:val="5"/>
-    <w:lvlOverride w:ilvl="0"/>
-    <w:lvlOverride w:ilvl="1"/>
-    <w:lvlOverride w:ilvl="2"/>
-    <w:lvlOverride w:ilvl="3"/>
-    <w:lvlOverride w:ilvl="4"/>
-    <w:lvlOverride w:ilvl="5"/>
-    <w:lvlOverride w:ilvl="6"/>
-    <w:lvlOverride w:ilvl="7"/>
-    <w:lvlOverride w:ilvl="8"/>
   </w:num>
-  <w:num w:numId="11" w16cid:durableId="1846246251">
+  <w:num w:numId="11">
     <w:abstractNumId w:val="4"/>
     <w:lvlOverride w:ilvl="0">
       <w:startOverride w:val="1"/>
@@ -21343,55 +21717,19 @@
       <w:startOverride w:val="1"/>
     </w:lvlOverride>
   </w:num>
-  <w:num w:numId="12" w16cid:durableId="347222458">
+  <w:num w:numId="12">
     <w:abstractNumId w:val="11"/>
-    <w:lvlOverride w:ilvl="0"/>
-    <w:lvlOverride w:ilvl="1"/>
-    <w:lvlOverride w:ilvl="2"/>
-    <w:lvlOverride w:ilvl="3"/>
-    <w:lvlOverride w:ilvl="4"/>
-    <w:lvlOverride w:ilvl="5"/>
-    <w:lvlOverride w:ilvl="6"/>
-    <w:lvlOverride w:ilvl="7"/>
-    <w:lvlOverride w:ilvl="8"/>
   </w:num>
-  <w:num w:numId="13" w16cid:durableId="1580602548">
+  <w:num w:numId="13">
     <w:abstractNumId w:val="14"/>
-    <w:lvlOverride w:ilvl="0"/>
-    <w:lvlOverride w:ilvl="1"/>
-    <w:lvlOverride w:ilvl="2"/>
-    <w:lvlOverride w:ilvl="3"/>
-    <w:lvlOverride w:ilvl="4"/>
-    <w:lvlOverride w:ilvl="5"/>
-    <w:lvlOverride w:ilvl="6"/>
-    <w:lvlOverride w:ilvl="7"/>
-    <w:lvlOverride w:ilvl="8"/>
   </w:num>
-  <w:num w:numId="14" w16cid:durableId="1304850023">
+  <w:num w:numId="14">
     <w:abstractNumId w:val="13"/>
-    <w:lvlOverride w:ilvl="0"/>
-    <w:lvlOverride w:ilvl="1"/>
-    <w:lvlOverride w:ilvl="2"/>
-    <w:lvlOverride w:ilvl="3"/>
-    <w:lvlOverride w:ilvl="4"/>
-    <w:lvlOverride w:ilvl="5"/>
-    <w:lvlOverride w:ilvl="6"/>
-    <w:lvlOverride w:ilvl="7"/>
-    <w:lvlOverride w:ilvl="8"/>
   </w:num>
-  <w:num w:numId="15" w16cid:durableId="1394816545">
+  <w:num w:numId="15">
     <w:abstractNumId w:val="2"/>
-    <w:lvlOverride w:ilvl="0"/>
-    <w:lvlOverride w:ilvl="1"/>
-    <w:lvlOverride w:ilvl="2"/>
-    <w:lvlOverride w:ilvl="3"/>
-    <w:lvlOverride w:ilvl="4"/>
-    <w:lvlOverride w:ilvl="5"/>
-    <w:lvlOverride w:ilvl="6"/>
-    <w:lvlOverride w:ilvl="7"/>
-    <w:lvlOverride w:ilvl="8"/>
   </w:num>
-  <w:num w:numId="16" w16cid:durableId="1756439557">
+  <w:num w:numId="16">
     <w:abstractNumId w:val="17"/>
     <w:lvlOverride w:ilvl="0">
       <w:startOverride w:val="1"/>
@@ -21421,41 +21759,23 @@
       <w:startOverride w:val="1"/>
     </w:lvlOverride>
   </w:num>
-  <w:num w:numId="17" w16cid:durableId="928349018">
+  <w:num w:numId="17">
     <w:abstractNumId w:val="9"/>
-    <w:lvlOverride w:ilvl="0"/>
-    <w:lvlOverride w:ilvl="1"/>
-    <w:lvlOverride w:ilvl="2"/>
-    <w:lvlOverride w:ilvl="3"/>
-    <w:lvlOverride w:ilvl="4"/>
-    <w:lvlOverride w:ilvl="5"/>
-    <w:lvlOverride w:ilvl="6"/>
-    <w:lvlOverride w:ilvl="7"/>
-    <w:lvlOverride w:ilvl="8"/>
   </w:num>
-  <w:num w:numId="18" w16cid:durableId="1135175182">
+  <w:num w:numId="18">
     <w:abstractNumId w:val="1"/>
-    <w:lvlOverride w:ilvl="0"/>
-    <w:lvlOverride w:ilvl="1"/>
-    <w:lvlOverride w:ilvl="2"/>
-    <w:lvlOverride w:ilvl="3"/>
-    <w:lvlOverride w:ilvl="4"/>
-    <w:lvlOverride w:ilvl="5"/>
-    <w:lvlOverride w:ilvl="6"/>
-    <w:lvlOverride w:ilvl="7"/>
-    <w:lvlOverride w:ilvl="8"/>
   </w:num>
-  <w:num w:numId="19" w16cid:durableId="981616005">
+  <w:num w:numId="19">
     <w:abstractNumId w:val="12"/>
   </w:num>
-  <w:num w:numId="20" w16cid:durableId="1092779982">
+  <w:num w:numId="20">
     <w:abstractNumId w:val="18"/>
   </w:num>
 </w:numbering>
 </file>
 
 <file path=word/styles.xml><?xml version="1.0" encoding="utf-8"?>
-<w:styles xmlns:mc="http://schemas.openxmlformats.org/markup-compatibility/2006" xmlns:r="http://schemas.openxmlformats.org/officeDocument/2006/relationships" xmlns:w="http://schemas.openxmlformats.org/wordprocessingml/2006/main" xmlns:w14="http://schemas.microsoft.com/office/word/2010/wordml" xmlns:w15="http://schemas.microsoft.com/office/word/2012/wordml" xmlns:w16cex="http://schemas.microsoft.com/office/word/2018/wordml/cex" xmlns:w16cid="http://schemas.microsoft.com/office/word/2016/wordml/cid" xmlns:w16="http://schemas.microsoft.com/office/word/2018/wordml" xmlns:w16du="http://schemas.microsoft.com/office/word/2023/wordml/word16du" xmlns:w16sdtdh="http://schemas.microsoft.com/office/word/2020/wordml/sdtdatahash" xmlns:w16sdtfl="http://schemas.microsoft.com/office/word/2024/wordml/sdtformatlock" xmlns:w16se="http://schemas.microsoft.com/office/word/2015/wordml/symex" mc:Ignorable="w14 w15 w16se w16cid w16 w16cex w16sdtdh w16sdtfl w16du">
+<w:styles xmlns:mc="http://schemas.openxmlformats.org/markup-compatibility/2006" xmlns:r="http://schemas.openxmlformats.org/officeDocument/2006/relationships" xmlns:w="http://schemas.openxmlformats.org/wordprocessingml/2006/main" xmlns:w14="http://schemas.microsoft.com/office/word/2010/wordml" xmlns:w15="http://schemas.microsoft.com/office/word/2012/wordml" xmlns:w16cid="http://schemas.microsoft.com/office/word/2016/wordml/cid" xmlns:w16se="http://schemas.microsoft.com/office/word/2015/wordml/symex" mc:Ignorable="w14 w15 w16se w16cid">
   <w:docDefaults>
     <w:rPrDefault>
       <w:rPr>
@@ -21471,7 +21791,7 @@
       </w:pPr>
     </w:pPrDefault>
   </w:docDefaults>
-  <w:latentStyles w:defLockedState="0" w:defUIPriority="99" w:defSemiHidden="0" w:defUnhideWhenUsed="0" w:defQFormat="0" w:count="376">
+  <w:latentStyles w:defLockedState="0" w:defUIPriority="99" w:defSemiHidden="0" w:defUnhideWhenUsed="0" w:defQFormat="0" w:count="375">
     <w:lsdException w:name="Normal" w:uiPriority="0" w:qFormat="1"/>
     <w:lsdException w:name="heading 1" w:uiPriority="9" w:qFormat="1"/>
     <w:lsdException w:name="heading 2" w:semiHidden="1" w:uiPriority="9" w:unhideWhenUsed="1" w:qFormat="1"/>
@@ -21847,7 +22167,6 @@
     <w:lsdException w:name="Smart Hyperlink" w:semiHidden="1" w:unhideWhenUsed="1"/>
     <w:lsdException w:name="Hashtag" w:semiHidden="1" w:unhideWhenUsed="1"/>
     <w:lsdException w:name="Unresolved Mention" w:semiHidden="1" w:unhideWhenUsed="1"/>
-    <w:lsdException w:name="Smart Link" w:semiHidden="1" w:unhideWhenUsed="1"/>
   </w:latentStyles>
   <w:style w:type="paragraph" w:default="1" w:styleId="Normal">
     <w:name w:val="Normal"/>
@@ -21879,6 +22198,7 @@
   <w:style w:type="character" w:default="1" w:styleId="Fuentedeprrafopredeter">
     <w:name w:val="Default Paragraph Font"/>
     <w:uiPriority w:val="1"/>
+    <w:semiHidden/>
     <w:unhideWhenUsed/>
   </w:style>
   <w:style w:type="table" w:default="1" w:styleId="Tablanormal">

</xml_diff>